<commit_message>
Titel-Länge und Intro-Hinweis-Formatierung als Standard angepasst
Basierend auf Kevins eigener, in Pages überarbeiteter Fassung des
Ängste-und-Leidenschaften-Dokuments: Titel kurz und knapp halten, keine
Versionsnummern im Titel. Einleitender Hinweistext direkt unter dem Titel
läuft ab jetzt flush-links wie der restliche Text (para mit italics),
nicht eingerückt wie note(). Die eingerückte note()-Formatierung bleibt
für kleinere Zwischenanmerkungen weiter unten im Dokument reserviert.
In design-vorlage.md als Standard dokumentiert und im
Ängste-und-Leidenschaften-Dokument umgesetzt.

Co-Authored-By: Claude Sonnet 5 <noreply@anthropic.com>
Claude-Session: https://claude.ai/code/session_01DeqSdBatYE6t9FA6GS9TPf
</commit_message>
<xml_diff>
--- a/vertrieb/Recognize-You-Aengste-und-Leidenschaften-Tabelle.docx
+++ b/vertrieb/Recognize-You-Aengste-und-Leidenschaften-Tabelle.docx
@@ -14,26 +14,25 @@
           <w:sz w:val="40"/>
           <w:szCs w:val="40"/>
         </w:rPr>
-        <w:t xml:space="preserve">Version 2: Geschäftliche Ängste plus private Ängste und Leidenschaften</w:t>
-      </w:r>
-    </w:p>
-    <w:p>
-      <w:pPr>
-        <w:spacing w:after="0" w:before="0"/>
-      </w:pPr>
-      <w:r>
-        <w:rPr>
-          <w:rFonts w:ascii="Calibri" w:cs="Calibri" w:eastAsia="Calibri" w:hAnsi="Calibri"/>
-          <w:sz w:val="22"/>
-          <w:szCs w:val="22"/>
-        </w:rPr>
-        <w:t xml:space="preserve"/>
-      </w:r>
-    </w:p>
-    <w:p>
-      <w:pPr>
-        <w:spacing w:after="0" w:before="0"/>
-        <w:ind w:left="300"/>
+        <w:t xml:space="preserve">Ängste und Leidenschaften</w:t>
+      </w:r>
+    </w:p>
+    <w:p>
+      <w:pPr>
+        <w:spacing w:after="0" w:before="0"/>
+      </w:pPr>
+      <w:r>
+        <w:rPr>
+          <w:rFonts w:ascii="Calibri" w:cs="Calibri" w:eastAsia="Calibri" w:hAnsi="Calibri"/>
+          <w:sz w:val="22"/>
+          <w:szCs w:val="22"/>
+        </w:rPr>
+        <w:t xml:space="preserve"/>
+      </w:r>
+    </w:p>
+    <w:p>
+      <w:pPr>
+        <w:spacing w:after="0" w:before="0"/>
       </w:pPr>
       <w:r>
         <w:rPr>
@@ -42,8 +41,8 @@
           <w:bCs w:val="false"/>
           <w:i/>
           <w:iCs/>
-          <w:sz w:val="19"/>
-          <w:szCs w:val="19"/>
+          <w:sz w:val="22"/>
+          <w:szCs w:val="22"/>
         </w:rPr>
         <w:t xml:space="preserve">Private Ängste und Leidenschaften sind keine feststehenden Eigenschaften jedes Unternehmers. Sie sind </w:t>
       </w:r>
@@ -54,10 +53,10 @@
           <w:bCs/>
           <w:i/>
           <w:iCs/>
-          <w:sz w:val="19"/>
-          <w:szCs w:val="19"/>
-        </w:rPr>
-        <w:t xml:space="preserve">respektvoll zu prüfende Gesprächshypothesen</w:t>
+          <w:sz w:val="22"/>
+          <w:szCs w:val="22"/>
+        </w:rPr>
+        <w:t xml:space="preserve">Gesprächshypothesen</w:t>
       </w:r>
       <w:r>
         <w:rPr>
@@ -66,10 +65,10 @@
           <w:bCs w:val="false"/>
           <w:i/>
           <w:iCs/>
-          <w:sz w:val="19"/>
-          <w:szCs w:val="19"/>
-        </w:rPr>
-        <w:t xml:space="preserve">, keine Schwachstellen, die in der Ansprache ausgenutzt werden dürfen.</w:t>
+          <w:sz w:val="22"/>
+          <w:szCs w:val="22"/>
+        </w:rPr>
+        <w:t xml:space="preserve"> und keine Schwachstellen, die in der Ansprache ausgenutzt werden dürfen.</w:t>
       </w:r>
     </w:p>
     <w:p>

</xml_diff>

<commit_message>
Zwischenüberschriften in Text-Referenzdokumenten deutlich vergrößert
Pixelgenauer Abgleich mit Kevins eigener, in Pages überarbeiteter Fassung
des Ängste-und-Leidenschaften-Dokuments zeigt: seine Zwischenüberschriften
sind klar sichtbar größer als der Fließtext (ca. 14pt gegen 11pt), der
bisherige subHeading()-Standard (11,5pt) war davon kaum zu unterscheiden.
Für dieses Dokument auf 14pt gesetzt, Fettschnitt bleibt normal. Als
Standard für reine Text-Referenzdokumente in design-vorlage.md ergänzt.

Co-Authored-By: Claude Sonnet 5 <noreply@anthropic.com>
Claude-Session: https://claude.ai/code/session_01DeqSdBatYE6t9FA6GS9TPf
</commit_message>
<xml_diff>
--- a/vertrieb/Recognize-You-Aengste-und-Leidenschaften-Tabelle.docx
+++ b/vertrieb/Recognize-You-Aengste-und-Leidenschaften-Tabelle.docx
@@ -93,8 +93,8 @@
           <w:rFonts w:ascii="Calibri" w:cs="Calibri" w:eastAsia="Calibri" w:hAnsi="Calibri"/>
           <w:b/>
           <w:bCs/>
-          <w:sz w:val="23"/>
-          <w:szCs w:val="23"/>
+          <w:sz w:val="28"/>
+          <w:szCs w:val="28"/>
         </w:rPr>
         <w:t xml:space="preserve">Unternehmen und Lebenswerk</w:t>
       </w:r>
@@ -229,8 +229,8 @@
           <w:rFonts w:ascii="Calibri" w:cs="Calibri" w:eastAsia="Calibri" w:hAnsi="Calibri"/>
           <w:b/>
           <w:bCs/>
-          <w:sz w:val="23"/>
-          <w:szCs w:val="23"/>
+          <w:sz w:val="28"/>
+          <w:szCs w:val="28"/>
         </w:rPr>
         <w:t xml:space="preserve">Familie</w:t>
       </w:r>
@@ -365,8 +365,8 @@
           <w:rFonts w:ascii="Calibri" w:cs="Calibri" w:eastAsia="Calibri" w:hAnsi="Calibri"/>
           <w:b/>
           <w:bCs/>
-          <w:sz w:val="23"/>
-          <w:szCs w:val="23"/>
+          <w:sz w:val="28"/>
+          <w:szCs w:val="28"/>
         </w:rPr>
         <w:t xml:space="preserve">Gesundheit und Belastbarkeit</w:t>
       </w:r>
@@ -501,8 +501,8 @@
           <w:rFonts w:ascii="Calibri" w:cs="Calibri" w:eastAsia="Calibri" w:hAnsi="Calibri"/>
           <w:b/>
           <w:bCs/>
-          <w:sz w:val="23"/>
-          <w:szCs w:val="23"/>
+          <w:sz w:val="28"/>
+          <w:szCs w:val="28"/>
         </w:rPr>
         <w:t xml:space="preserve">Anerkennung und Selbstbild</w:t>
       </w:r>
@@ -637,8 +637,8 @@
           <w:rFonts w:ascii="Calibri" w:cs="Calibri" w:eastAsia="Calibri" w:hAnsi="Calibri"/>
           <w:b/>
           <w:bCs/>
-          <w:sz w:val="23"/>
-          <w:szCs w:val="23"/>
+          <w:sz w:val="28"/>
+          <w:szCs w:val="28"/>
         </w:rPr>
         <w:t xml:space="preserve">Verantwortung für Mitarbeitende</w:t>
       </w:r>
@@ -773,8 +773,8 @@
           <w:rFonts w:ascii="Calibri" w:cs="Calibri" w:eastAsia="Calibri" w:hAnsi="Calibri"/>
           <w:b/>
           <w:bCs/>
-          <w:sz w:val="23"/>
-          <w:szCs w:val="23"/>
+          <w:sz w:val="28"/>
+          <w:szCs w:val="28"/>
         </w:rPr>
         <w:t xml:space="preserve">Freiheit und Kontrolle</w:t>
       </w:r>
@@ -909,8 +909,8 @@
           <w:rFonts w:ascii="Calibri" w:cs="Calibri" w:eastAsia="Calibri" w:hAnsi="Calibri"/>
           <w:b/>
           <w:bCs/>
-          <w:sz w:val="23"/>
-          <w:szCs w:val="23"/>
+          <w:sz w:val="28"/>
+          <w:szCs w:val="28"/>
         </w:rPr>
         <w:t xml:space="preserve">Ruf und Vertrauen</w:t>
       </w:r>
@@ -1045,8 +1045,8 @@
           <w:rFonts w:ascii="Calibri" w:cs="Calibri" w:eastAsia="Calibri" w:hAnsi="Calibri"/>
           <w:b/>
           <w:bCs/>
-          <w:sz w:val="23"/>
-          <w:szCs w:val="23"/>
+          <w:sz w:val="28"/>
+          <w:szCs w:val="28"/>
         </w:rPr>
         <w:t xml:space="preserve">Nachfolge und Zukunft</w:t>
       </w:r>
@@ -1181,8 +1181,8 @@
           <w:rFonts w:ascii="Calibri" w:cs="Calibri" w:eastAsia="Calibri" w:hAnsi="Calibri"/>
           <w:b/>
           <w:bCs/>
-          <w:sz w:val="23"/>
-          <w:szCs w:val="23"/>
+          <w:sz w:val="28"/>
+          <w:szCs w:val="28"/>
         </w:rPr>
         <w:t xml:space="preserve">Wachstum und Bedeutung</w:t>
       </w:r>

</xml_diff>